<commit_message>
Correct finding 1 of the WS2 summary: the EEM overlap was frequent, not rare
The artefact (ws2_eem_coherence.json double_count_quantification) shows
B held EEM on 45% of all days (mean 12% of the book when held, max 20%)
and on 88% of tilt-ON days BOTH routes held it together. The earlier
gloss "B's top-K held EEM rarely" was wrong and is corrected in the
memo (marked as a dated correction) and the Phase 29 engine comment.
The filed technical record and test appendix never contained the claim
(verified). Summary reworded: heading narrowed to the broad-EM FUND
(book C's China-tech names are separate theme positions, at most 4%
look-through); chart key relabelled — 10% is the overlay's size and the
NEW set-up's cap, the old design had no combined cap (that absence is
the finding). Verification script extended to 19 checks, all passing;
docx rebuilt, validated and page-QA'd.
</commit_message>
<xml_diff>
--- a/reviews/2026-07-03_ws2_universe_summary.docx
+++ b/reviews/2026-07-03_ws2_universe_summary.docx
@@ -190,7 +190,7 @@
                 <w:sz w:val="18"/>
                 <w:szCs w:val="18"/>
               </w:rPr>
-              <w:t xml:space="preserve">Nothing worth adding is missing — every candidate addition failed on data the models had never seen. One accidental double position was found and fixed: emerging markets was held two ways at once and is now held one way only. Everything else stays exactly as it was.</w:t>
+              <w:t xml:space="preserve">Nothing worth adding is missing — every candidate addition failed on data the models had never seen. One accidental double position was found and fixed: the broad emerging-markets fund was held through two mechanisms at once, with nothing capping the combined size; it is now held through one. Everything else stays exactly as it was.</w:t>
             </w:r>
           </w:p>
         </w:tc>
@@ -280,15 +280,15 @@
           <w:sz w:val="24"/>
           <w:szCs w:val="24"/>
         </w:rPr>
-        <w:t xml:space="preserve">1. Emerging markets was held two ways at once — that is now fixed.</w:t>
-      </w:r>
-    </w:p>
-    <w:p>
-      <w:pPr>
-        <w:spacing w:after="120" w:before="0"/>
-      </w:pPr>
-      <w:r>
-        <w:t xml:space="preserve">The EM fund sat inside the global asset-class book while the EM overlay added the same exposure again on top, so the true EM position peaked at 15% of the portfolio — half as much again as the intended 10% — and both routes held it simultaneously on roughly a quarter of all days.</w:t>
+        <w:t xml:space="preserve">1. The broad emerging-markets fund was held two ways at once — that is now fixed.</w:t>
+      </w:r>
+    </w:p>
+    <w:p>
+      <w:pPr>
+        <w:spacing w:after="120" w:before="0"/>
+      </w:pPr>
+      <w:r>
+        <w:t xml:space="preserve">The EM fund sat inside the global asset-class book — which held it on 45% of all days, and on 88% of the days the EM overlay was also on — so the combined position repeatedly ran to 15% of the portfolio with no rule anywhere capping it; since 2 July 2026 the overlay is the only route into the fund.</w:t>
       </w:r>
     </w:p>
     <w:p>
@@ -299,9 +299,9 @@
       <w:r>
         <w:drawing>
           <wp:inline distT="0" distB="0" distL="0" distR="0">
-            <wp:extent cx="5715000" cy="2476500"/>
+            <wp:extent cx="5715000" cy="2667000"/>
             <wp:effectExtent t="0" r="0" b="0" l="0"/>
-            <wp:docPr id="1" name="ws2_sum_eem_lookthrough.png" descr="Navy: how much emerging markets the portfolio actually held under the old set-up. Teal dashes: the new set-up, live since 2 July 2026 — the overlay is the only EM position, so the line can never exceed 10%. Red shading marks the excess." title="Navy: how much emerging markets the portfolio actually held under the old set-up. Teal dashes: the new set-up, live since 2 July 2026 — the overlay is the only EM position, so the line can never exceed 10%. Red shading marks the excess."/>
+            <wp:docPr id="1" name="ws2_sum_eem_lookthrough.png" descr="Navy: how much of the broad-EM fund the portfolio actually held under the old set-up. Teal dashes: the new set-up — the overlay is the only route, hard-capped at 10%. Red shading marks the excess. The thematic book's China-technology names are separate, deliberately-sized theme positions (at most 4% of the portfolio in this window)." title="Navy: how much of the broad-EM fund the portfolio actually held under the old set-up. Teal dashes: the new set-up — the overlay is the only route, hard-capped at 10%. Red shading marks the excess. The thematic book's China-technology names are separate, deliberately-sized theme positions (at most 4% of the portfolio in this window)."/>
             <wp:cNvGraphicFramePr>
               <a:graphicFrameLocks xmlns:a="http://schemas.openxmlformats.org/drawingml/2006/main" noChangeAspect="1"/>
             </wp:cNvGraphicFramePr>
@@ -324,7 +324,7 @@
                   <pic:spPr bwMode="auto">
                     <a:xfrm>
                       <a:off x="0" y="0"/>
-                      <a:ext cx="5715000" cy="2476500"/>
+                      <a:ext cx="5715000" cy="2667000"/>
                     </a:xfrm>
                     <a:prstGeom prst="rect">
                       <a:avLst/>
@@ -350,7 +350,7 @@
           <w:sz w:val="18"/>
           <w:szCs w:val="18"/>
         </w:rPr>
-        <w:t xml:space="preserve">Navy: how much emerging markets the portfolio actually held under the old set-up. Teal dashes: the new set-up, live since 2 July 2026 — the overlay is the only EM position, so the line can never exceed 10%. Red shading marks the excess.</w:t>
+        <w:t xml:space="preserve">Navy: how much of the broad-EM fund the portfolio actually held under the old set-up. Teal dashes: the new set-up — the overlay is the only route, hard-capped at 10%. Red shading marks the excess. The thematic book's China-technology names are separate, deliberately-sized theme positions (at most 4% of the portfolio in this window).</w:t>
       </w:r>
     </w:p>
     <w:p>
@@ -1318,6 +1318,114 @@
       </w:pPr>
     </w:lvl>
   </w:abstractNum>
+  <w:abstractNum w:abstractNumId="4" w15:restartNumberingAfterBreak="0">
+    <w:multiLevelType w:val="hybridMultilevel"/>
+    <w:lvl w:ilvl="0" w15:tentative="1">
+      <w:start w:val="1"/>
+      <w:numFmt w:val="decimal"/>
+      <w:lvlText w:val="%1."/>
+      <w:lvlJc w:val="left"/>
+      <w:pPr>
+        <w:ind w:left="500" w:hanging="280"/>
+      </w:pPr>
+    </w:lvl>
+  </w:abstractNum>
+  <w:abstractNum w:abstractNumId="5" w15:restartNumberingAfterBreak="0">
+    <w:multiLevelType w:val="hybridMultilevel"/>
+    <w:lvl w:ilvl="0" w15:tentative="1">
+      <w:start w:val="1"/>
+      <w:numFmt w:val="decimal"/>
+      <w:lvlText w:val="%1."/>
+      <w:lvlJc w:val="left"/>
+      <w:pPr>
+        <w:ind w:left="500" w:hanging="280"/>
+      </w:pPr>
+    </w:lvl>
+  </w:abstractNum>
+  <w:abstractNum w:abstractNumId="6" w15:restartNumberingAfterBreak="0">
+    <w:multiLevelType w:val="hybridMultilevel"/>
+    <w:lvl w:ilvl="0" w15:tentative="1">
+      <w:start w:val="1"/>
+      <w:numFmt w:val="decimal"/>
+      <w:lvlText w:val="%1."/>
+      <w:lvlJc w:val="left"/>
+      <w:pPr>
+        <w:ind w:left="500" w:hanging="280"/>
+      </w:pPr>
+    </w:lvl>
+  </w:abstractNum>
+  <w:abstractNum w:abstractNumId="7" w15:restartNumberingAfterBreak="0">
+    <w:multiLevelType w:val="hybridMultilevel"/>
+    <w:lvl w:ilvl="0" w15:tentative="1">
+      <w:start w:val="1"/>
+      <w:numFmt w:val="decimal"/>
+      <w:lvlText w:val="%1."/>
+      <w:lvlJc w:val="left"/>
+      <w:pPr>
+        <w:ind w:left="500" w:hanging="280"/>
+      </w:pPr>
+    </w:lvl>
+  </w:abstractNum>
+  <w:abstractNum w:abstractNumId="8" w15:restartNumberingAfterBreak="0">
+    <w:multiLevelType w:val="hybridMultilevel"/>
+    <w:lvl w:ilvl="0" w15:tentative="1">
+      <w:start w:val="1"/>
+      <w:numFmt w:val="decimal"/>
+      <w:lvlText w:val="%1."/>
+      <w:lvlJc w:val="left"/>
+      <w:pPr>
+        <w:ind w:left="500" w:hanging="280"/>
+      </w:pPr>
+    </w:lvl>
+  </w:abstractNum>
+  <w:abstractNum w:abstractNumId="9" w15:restartNumberingAfterBreak="0">
+    <w:multiLevelType w:val="hybridMultilevel"/>
+    <w:lvl w:ilvl="0" w15:tentative="1">
+      <w:start w:val="1"/>
+      <w:numFmt w:val="decimal"/>
+      <w:lvlText w:val="%1."/>
+      <w:lvlJc w:val="left"/>
+      <w:pPr>
+        <w:ind w:left="500" w:hanging="280"/>
+      </w:pPr>
+    </w:lvl>
+  </w:abstractNum>
+  <w:abstractNum w:abstractNumId="10" w15:restartNumberingAfterBreak="0">
+    <w:multiLevelType w:val="hybridMultilevel"/>
+    <w:lvl w:ilvl="0" w15:tentative="1">
+      <w:start w:val="1"/>
+      <w:numFmt w:val="decimal"/>
+      <w:lvlText w:val="%1."/>
+      <w:lvlJc w:val="left"/>
+      <w:pPr>
+        <w:ind w:left="500" w:hanging="280"/>
+      </w:pPr>
+    </w:lvl>
+  </w:abstractNum>
+  <w:abstractNum w:abstractNumId="11" w15:restartNumberingAfterBreak="0">
+    <w:multiLevelType w:val="hybridMultilevel"/>
+    <w:lvl w:ilvl="0" w15:tentative="1">
+      <w:start w:val="1"/>
+      <w:numFmt w:val="decimal"/>
+      <w:lvlText w:val="%1."/>
+      <w:lvlJc w:val="left"/>
+      <w:pPr>
+        <w:ind w:left="500" w:hanging="280"/>
+      </w:pPr>
+    </w:lvl>
+  </w:abstractNum>
+  <w:abstractNum w:abstractNumId="12" w15:restartNumberingAfterBreak="0">
+    <w:multiLevelType w:val="hybridMultilevel"/>
+    <w:lvl w:ilvl="0" w15:tentative="1">
+      <w:start w:val="1"/>
+      <w:numFmt w:val="decimal"/>
+      <w:lvlText w:val="%1."/>
+      <w:lvlJc w:val="left"/>
+      <w:pPr>
+        <w:ind w:left="500" w:hanging="280"/>
+      </w:pPr>
+    </w:lvl>
+  </w:abstractNum>
   <w:num w:numId="1">
     <w:abstractNumId w:val="1"/>
     <w:lvlOverride w:ilvl="0">

</xml_diff>